<commit_message>
fix(template): add manager_signature + security_staff_count to DOCX, fix UploadOutlined import (补全模板+修复导入)
- DOCX templates: add {{ manager_signature }} placeholder to security plan + 双表
- DOCX templates: add {{ security_staff_count }} to security plan
- Frontend: add missing UploadOutlined import in ActivityDetailPage
</commit_message>
<xml_diff>
--- a/app/templates/responsibility_letter/template.docx
+++ b/app/templates/responsibility_letter/template.docx
@@ -80,6 +80,11 @@
     <w:p>
       <w:r>
         <w:t>确认地点：{{ confirm_location }}</w:t>
+      </w:r>
+    </w:p>
+    <w:p>
+      <w:r>
+        <w:t>安保负责人审核签名：{{ manager_signature }}</w:t>
       </w:r>
     </w:p>
     <w:sectPr>

</xml_diff>